<commit_message>
translate all deliverables to Korean
- nvidia-customer-analysis.md: full Korean rewrite, URLs and figures unchanged
- nvidia-value-chain.svg: Korean labels, box widths recomputed with Hangul
  counted as two units so max(title*8, subtitle*7)+24 still contains the text
- nvidia-value-chain.original.svg: Korean labels on the previous 1600x1050 layout
- NVIDIA_customer_analysis.docx: all 107 text runs translated in place,
  zip and XML integrity re-validated
- README.md: Korean title

Layout verification rerun on the 680px diagram: no box, text, or connector
overlaps and no safe-area violations.

Co-Authored-By: Claude Opus 5 <noreply@anthropic.com>
Claude-Session: https://claude.ai/code/session_01F3mZS59KAKXBHpbdLMyx4W
</commit_message>
<xml_diff>
--- a/NVIDIA_customer_analysis.docx
+++ b/NVIDIA_customer_analysis.docx
@@ -8,7 +8,7 @@
         <w:jc w:val="center"/>
       </w:pPr>
       <w:r>
-        <w:t>NVIDIA Customer Concentration &amp; AI Infrastructure Value Chain</w:t>
+        <w:t>NVIDIA 고객 집중도 &amp; AI 인프라 가치사슬</w:t>
       </w:r>
     </w:p>
     <w:p>
@@ -19,7 +19,7 @@
         <w:rPr>
           <w:b/>
         </w:rPr>
-        <w:t>FY2027 H1 reconstruction | SEC facts separated from inference</w:t>
+        <w:t>FY2027 상반기 재구성 | SEC 확인 사실과 추론을 분리</w:t>
       </w:r>
     </w:p>
     <w:p>
@@ -27,7 +27,7 @@
         <w:pStyle w:val="Heading1"/>
       </w:pPr>
       <w:r>
-        <w:t>1. Executive summary</w:t>
+        <w:t>1. 요약</w:t>
       </w:r>
     </w:p>
     <w:p>
@@ -35,7 +35,7 @@
         <w:pStyle w:val="ListBullet"/>
       </w:pPr>
       <w:r>
-        <w:t>NVIDIA discloses customer concentration but does not name the largest direct customers in current filings.</w:t>
+        <w:t>NVIDIA는 고객 집중도를 공시하지만 현재 제출 서류에서 최대 직접고객의 이름은 밝히지 않는다.</w:t>
       </w:r>
     </w:p>
     <w:p>
@@ -43,7 +43,7 @@
         <w:pStyle w:val="ListBullet"/>
       </w:pPr>
       <w:r>
-        <w:t>The analysis therefore separates evidence into four levels: SEC confirmed, official disclosure, mathematical inference, and analytical hypothesis.</w:t>
+        <w:t>따라서 이 분석은 근거를 네 단계로 나눈다. SEC 확인, 공식 발표, 수학적 추론, 분석적 가설.</w:t>
       </w:r>
     </w:p>
     <w:p>
@@ -51,7 +51,7 @@
         <w:pStyle w:val="ListBullet"/>
       </w:pPr>
       <w:r>
-        <w:t>Working reconstruction: D1 = Microsoft/Azure hypothesis (~45% confidence), D2 = Meta/other US CSP unresolved, D3 = AWS hypothesis (~50%). These identities are not SEC-confirmed.</w:t>
+        <w:t>잠정 재구성: D1 = Microsoft/Azure 가설(확신도 ~45%), D2 = Meta 또는 다른 미국 CSP로 미확정, D3 = AWS 가설(~50%). 이 정체들은 SEC가 확인한 것이 아니다.</w:t>
       </w:r>
     </w:p>
     <w:p>
@@ -59,7 +59,7 @@
         <w:pStyle w:val="Heading1"/>
       </w:pPr>
       <w:r>
-        <w:t>2. FY27 concentration reconstruction</w:t>
+        <w:t>2. FY27 집중도 재구성</w:t>
       </w:r>
     </w:p>
     <w:tbl>
@@ -83,7 +83,7 @@
           </w:tcPr>
           <w:p>
             <w:r>
-              <w:t>Fingerprint</w:t>
+              <w:t>지문</w:t>
             </w:r>
           </w:p>
         </w:tc>
@@ -93,7 +93,7 @@
           </w:tcPr>
           <w:p>
             <w:r>
-              <w:t>Q1</w:t>
+              <w:t>1분기</w:t>
             </w:r>
           </w:p>
         </w:tc>
@@ -103,7 +103,7 @@
           </w:tcPr>
           <w:p>
             <w:r>
-              <w:t>H1</w:t>
+              <w:t>상반기</w:t>
             </w:r>
           </w:p>
         </w:tc>
@@ -113,7 +113,7 @@
           </w:tcPr>
           <w:p>
             <w:r>
-              <w:t>Implied Q2</w:t>
+              <w:t>추정 2분기</w:t>
             </w:r>
           </w:p>
         </w:tc>
@@ -123,7 +123,7 @@
           </w:tcPr>
           <w:p>
             <w:r>
-              <w:t>Working identity</w:t>
+              <w:t>잠정 정체</w:t>
             </w:r>
           </w:p>
         </w:tc>
@@ -227,7 +227,7 @@
           </w:tcPr>
           <w:p>
             <w:r>
-              <w:t>Meta / other US CSP, unresolved</w:t>
+              <w:t>Meta / 다른 미국 CSP, 미확정</w:t>
             </w:r>
           </w:p>
         </w:tc>
@@ -287,7 +287,7 @@
     </w:tbl>
     <w:p>
       <w:r>
-        <w:t>Math basis: Q1 revenue $81.615B; Q2 $96.221B; H1 $177.837B. The above is the only clean permutation that leaves just one Q2 customer at or above the 10% disclosure threshold.</w:t>
+        <w:t>계산 근거: 1분기 매출 $81.615B, 2분기 $96.221B, 상반기 $177.837B. 위 조합은 2분기에 공시 기준선 10% 이상 고객을 하나만 남기는 유일하게 깔끔한 배열이다.</w:t>
       </w:r>
     </w:p>
     <w:p>
@@ -295,10 +295,10 @@
         <w:rPr>
           <w:b/>
         </w:rPr>
-        <w:t xml:space="preserve">Caveat: </w:t>
+        <w:t xml:space="preserve">주의: </w:t>
       </w:r>
       <w:r>
-        <w:t>NVIDIA has explicitly warned that Customer A/B/C labels may refer to different customers in different periods. D1/D2/D3 are our own analytical fingerprints.</w:t>
+        <w:t>NVIDIA는 Customer A/B/C 표기가 기간마다 다른 고객을 가리킬 수 있다고 명시적으로 경고했다. D1/D2/D3은 우리가 만든 분석용 지문이다.</w:t>
       </w:r>
     </w:p>
     <w:p>
@@ -306,22 +306,22 @@
         <w:pStyle w:val="Heading1"/>
       </w:pPr>
       <w:r>
-        <w:t>3. Geography elimination logic</w:t>
+        <w:t>3. 지역 소거 논리</w:t>
       </w:r>
     </w:p>
     <w:p>
       <w:r>
-        <w:t>Q1 geography: US $63.769B; Taiwan $12.006B; China/HK $4.550B; Other $1.290B.</w:t>
+        <w:t>1분기 지역별: 미국 $63.769B, 대만 $12.006B, 중국/홍콩 $4.550B, 기타 $1.290B.</w:t>
       </w:r>
     </w:p>
     <w:p>
       <w:r>
-        <w:t>Q1 top-customer revenue equivalents were ~$17.14B, ~$13.87B and ~$13.06B. Each exceeds all Q1 Taiwan-headquartered revenue. The strongest inference is that the three largest Q1 direct customers were overwhelmingly likely to be US-headquartered direct customers.</w:t>
+        <w:t>1분기 상위 고객의 매출 환산액은 각각 ~$17.14B, ~$13.87B, ~$13.06B였다. 각각이 1분기 대만 본사 고객 매출 전체를 넘는다. 가장 단단한 추론은 1분기 최대 직접고객 3곳이 미국에 본사를 둔 직접고객이었을 가능성이 압도적으로 높다는 것이다.</w:t>
       </w:r>
     </w:p>
     <w:p>
       <w:r>
-        <w:t>Q2 Taiwan revenue rose to $26.985B while US revenue declined to $60.074B. This is consistent with a procurement / booking-route shift toward Taiwan direct entities, though NVIDIA does not disclose that causal explanation.</w:t>
+        <w:t>2분기 대만 매출은 $26.985B로 늘고 미국 매출은 $60.074B로 줄었다. 조달/계상 경로가 대만 법인 쪽으로 이동했다는 설명과 맞아떨어지지만, NVIDIA가 그 인과를 공시하지는 않았다.</w:t>
       </w:r>
     </w:p>
     <w:p>
@@ -329,17 +329,17 @@
         <w:pStyle w:val="Heading1"/>
       </w:pPr>
       <w:r>
-        <w:t>4. Accounts receivable cross-check</w:t>
+        <w:t>4. 매출채권 교차 검증</w:t>
       </w:r>
     </w:p>
     <w:p>
       <w:r>
-        <w:t>Q1 AR = $40.710B; largest direct customers represented 30%, 18%, 16%. Q2 AR = $63.059B, up ~55% q/q; top five represented 22%, 14%, 13%, 11%, 10% (70% combined).</w:t>
+        <w:t>1분기 매출채권 $40.710B, 최대 직접고객 비중 30%, 18%, 16%. 2분기 매출채권 $63.059B로 전분기 대비 ~55% 증가, 상위 5곳이 22%, 14%, 13%, 11%, 10% (합계 70%).</w:t>
       </w:r>
     </w:p>
     <w:p>
       <w:r>
-        <w:t>Interpretation: AR grew materially faster than revenue, consistent with heavier late-quarter shipment / acceptance timing. Revenue rank and AR rank should not be mapped mechanically.</w:t>
+        <w:t>해석: 매출채권이 매출보다 뚜렷하게 빠르게 늘었고, 이는 분기 후반 출하/검수 비중이 컸다는 설명과 맞는다. 매출 순위와 매출채권 순위를 기계적으로 대응시키면 안 된다.</w:t>
       </w:r>
     </w:p>
     <w:p>
@@ -347,7 +347,7 @@
         <w:pStyle w:val="Heading1"/>
       </w:pPr>
       <w:r>
-        <w:t>5. Microsoft candidate</w:t>
+        <w:t>5. Microsoft 후보</w:t>
       </w:r>
     </w:p>
     <w:p>
@@ -355,7 +355,7 @@
         <w:pStyle w:val="ListBullet"/>
       </w:pPr>
       <w:r>
-        <w:t>Servers/network/software gross PP&amp;E: $171.351B at Dec-25 → $190.883B at Mar-26 → $215.874B at Jun-26.</w:t>
+        <w:t>서버/네트워크/소프트웨어 총 유형자산: 2025년 12월 $171.351B → 2026년 3월 $190.883B → 2026년 6월 $215.874B.</w:t>
       </w:r>
     </w:p>
     <w:p>
@@ -363,7 +363,7 @@
         <w:pStyle w:val="ListBullet"/>
       </w:pPr>
       <w:r>
-        <w:t>PP&amp;E purchases remaining in AP: $22.6B at Mar-26 and $26.7B at Jun-26.</w:t>
+        <w:t>매입채무에 남은 유형자산 매입액: 2026년 3월 $22.6B, 2026년 6월 $26.7B.</w:t>
       </w:r>
     </w:p>
     <w:p>
@@ -371,7 +371,7 @@
         <w:pStyle w:val="ListBullet"/>
       </w:pPr>
       <w:r>
-        <w:t>NVIDIA/Microsoft disclosed &gt;100,000 Blackwell Ultra GPUs in GB300 NVL72 systems globally.</w:t>
+        <w:t>NVIDIA/Microsoft는 GB300 NVL72 시스템에 Blackwell Ultra GPU &gt;100,000개를 전 세계에 배치했다고 밝혔다.</w:t>
       </w:r>
     </w:p>
     <w:p>
@@ -379,7 +379,7 @@
         <w:pStyle w:val="ListBullet"/>
       </w:pPr>
       <w:r>
-        <w:t>Working view: strongest fit for D1's front-loaded Q1 pattern; ~45% confidence, not confirmed.</w:t>
+        <w:t>잠정 판단: 1분기에 몰린 D1 패턴에 가장 잘 맞는다. 확신도 ~45%, 확인된 사실 아님.</w:t>
       </w:r>
     </w:p>
     <w:p>
@@ -387,7 +387,7 @@
         <w:pStyle w:val="Heading1"/>
       </w:pPr>
       <w:r>
-        <w:t>6. AWS candidate</w:t>
+        <w:t>6. AWS 후보</w:t>
       </w:r>
     </w:p>
     <w:p>
@@ -395,7 +395,7 @@
         <w:pStyle w:val="ListBullet"/>
       </w:pPr>
       <w:r>
-        <w:t>Q1 cash capex $43.2B; Q2 $53.1B; H1 $96.3B, with the majority of technology-infrastructure investment supporting AWS.</w:t>
+        <w:t>1분기 현금 설비투자 $43.2B, 2분기 $53.1B, 상반기 $96.3B이며 기술 인프라 투자 대부분이 AWS를 뒷받침한다.</w:t>
       </w:r>
     </w:p>
     <w:p>
@@ -403,7 +403,7 @@
         <w:pStyle w:val="ListBullet"/>
       </w:pPr>
       <w:r>
-        <w:t>Q1 AWS PP&amp;E net additions $41.516B.</w:t>
+        <w:t>1분기 AWS 유형자산 순증 $41.516B.</w:t>
       </w:r>
     </w:p>
     <w:p>
@@ -411,7 +411,7 @@
         <w:pStyle w:val="ListBullet"/>
       </w:pPr>
       <w:r>
-        <w:t>AWS/NVIDIA disclosed plans for &gt;1M NVIDIA GPUs starting in 2026, plus another 2M in 2027-2028.</w:t>
+        <w:t>AWS/NVIDIA는 2026년부터 NVIDIA GPU &gt;100만 개, 이어 2027-2028년에 200만 개를 추가한다고 밝혔다.</w:t>
       </w:r>
     </w:p>
     <w:p>
@@ -419,7 +419,7 @@
         <w:pStyle w:val="ListBullet"/>
       </w:pPr>
       <w:r>
-        <w:t>Working view: strongest fit for stable D3 16% fingerprint; ~50% confidence, not confirmed.</w:t>
+        <w:t>잠정 판단: 16%로 안정적인 D3 지문에 가장 잘 맞는다. 확신도 ~50%, 확인된 사실 아님.</w:t>
       </w:r>
     </w:p>
     <w:p>
@@ -427,7 +427,7 @@
         <w:pStyle w:val="Heading1"/>
       </w:pPr>
       <w:r>
-        <w:t>7. Meta candidate</w:t>
+        <w:t>7. Meta 후보</w:t>
       </w:r>
     </w:p>
     <w:p>
@@ -435,7 +435,7 @@
         <w:pStyle w:val="ListBullet"/>
       </w:pPr>
       <w:r>
-        <w:t>Q1 PP&amp;E purchases $19.0B; Q2 capex incl. finance leases $31.08B; 2026 capex outlook roughly $130B-$145B.</w:t>
+        <w:t>1분기 유형자산 매입 $19.0B, 금융리스 포함 2분기 설비투자 $31.08B, 2026년 설비투자 전망 약 $130B-$145B.</w:t>
       </w:r>
     </w:p>
     <w:p>
@@ -443,7 +443,7 @@
         <w:pStyle w:val="ListBullet"/>
       </w:pPr>
       <w:r>
-        <w:t>Servers/network assets rose from $98.040B at Dec-25 to $119.683B at Jun-26; construction in progress rose to $80.345B.</w:t>
+        <w:t>서버/네트워크 자산은 2025년 12월 $98.040B에서 2026년 6월 $119.683B로 늘었고, 건설중인자산은 $80.345B로 증가했다.</w:t>
       </w:r>
     </w:p>
     <w:p>
@@ -451,7 +451,7 @@
         <w:pStyle w:val="ListBullet"/>
       </w:pPr>
       <w:r>
-        <w:t>NVIDIA described a Meta partnership involving millions of Blackwell/Rubin GPUs.</w:t>
+        <w:t>NVIDIA는 Blackwell/Rubin GPU 수백만 개가 얽힌 Meta 협력을 설명했다.</w:t>
       </w:r>
     </w:p>
     <w:p>
@@ -459,7 +459,7 @@
         <w:pStyle w:val="ListBullet"/>
       </w:pPr>
       <w:r>
-        <w:t>Working view: huge economic NVIDIA customer but direct invoice can be fragmented across direct hardware, ODMs and third-party clouds; plausible D2, unresolved.</w:t>
+        <w:t>잠정 판단: 경제적으로 거대한 NVIDIA 고객이지만 직접 청구가 직접 조달, ODM, 제3자 클라우드로 쪼개질 수 있다. D2 자리가 유력하나 미확정.</w:t>
       </w:r>
     </w:p>
     <w:p>
@@ -467,7 +467,7 @@
         <w:pStyle w:val="Heading1"/>
       </w:pPr>
       <w:r>
-        <w:t>8. Other candidates</w:t>
+        <w:t>8. 기타 후보</w:t>
       </w:r>
     </w:p>
     <w:p>
@@ -475,7 +475,7 @@
         <w:pStyle w:val="ListBullet"/>
       </w:pPr>
       <w:r>
-        <w:t>Google: very large capex (~$80.6B H1), but heavy TPU usage lowers confidence as a top NVIDIA direct customer.</w:t>
+        <w:t>Google: 설비투자가 매우 크지만(상반기 ~$80.6B) TPU 비중이 높아 NVIDIA 최상위 직접고객일 확신도는 낮다.</w:t>
       </w:r>
     </w:p>
     <w:p>
@@ -483,7 +483,7 @@
         <w:pStyle w:val="ListBullet"/>
       </w:pPr>
       <w:r>
-        <w:t>Oracle: huge AI infrastructure commitments, but filings indicate some customers prepay for or supply GPUs, weakening direct-invoice mapping.</w:t>
+        <w:t>Oracle: AI 인프라 약정은 막대하지만, 일부 고객이 GPU 대금을 선지급하거나 GPU를 직접 공급한다고 제출 서류에 나타나 직접 청구 대응이 약해진다.</w:t>
       </w:r>
     </w:p>
     <w:p>
@@ -491,7 +491,7 @@
         <w:pStyle w:val="ListBullet"/>
       </w:pPr>
       <w:r>
-        <w:t>CoreWeave: 100% NVIDIA GPU fleet, but scale makes ~$13B-$17B per quarter of direct NVIDIA purchases unlikely.</w:t>
+        <w:t>CoreWeave: GPU 전량이 NVIDIA지만 규모상 분기당 ~$13B-$17B의 직접 구매는 어렵다.</w:t>
       </w:r>
     </w:p>
     <w:p>
@@ -499,32 +499,32 @@
         <w:pStyle w:val="Heading1"/>
       </w:pPr>
       <w:r>
-        <w:t>9. ODM / procurement-route framework</w:t>
+        <w:t>9. ODM / 조달 경로 프레임</w:t>
       </w:r>
     </w:p>
     <w:p>
       <w:r>
-        <w:t>1. NVIDIA invoice customer</w:t>
+        <w:t>1. NVIDIA 청구 고객</w:t>
       </w:r>
     </w:p>
     <w:p>
       <w:r>
-        <w:t>2. GPU economic owner</w:t>
+        <w:t>2. GPU 경제적 소유자</w:t>
       </w:r>
     </w:p>
     <w:p>
       <w:r>
-        <w:t>3. ODM / system assembler</w:t>
+        <w:t>3. ODM / 시스템 조립사</w:t>
       </w:r>
     </w:p>
     <w:p>
       <w:r>
-        <w:t>4. Compute consumer</w:t>
+        <w:t>4. 컴퓨트 소비자</w:t>
       </w:r>
     </w:p>
     <w:p>
       <w:r>
-        <w:t>Example: NVIDIA GPU → Foxconn assembly → Microsoft datacenter → OpenAI workload. If Microsoft owns the PO, NVIDIA geography can be US even though Foxconn assembles in Taiwan. If Foxconn owns the PO, geography can be Taiwan.</w:t>
+        <w:t>예시: NVIDIA GPU → Foxconn 조립 → Microsoft 데이터센터 → OpenAI 워크로드. Microsoft가 발주서를 보유하면 Foxconn이 대만에서 조립해도 NVIDIA 지역은 미국이 될 수 있다. Foxconn이 발주서를 보유하면 지역은 대만이 된다.</w:t>
       </w:r>
     </w:p>
     <w:p>
@@ -532,7 +532,7 @@
         <w:pStyle w:val="Heading1"/>
       </w:pPr>
       <w:r>
-        <w:t>10. Working ranking</w:t>
+        <w:t>10. 잠정 순위</w:t>
       </w:r>
     </w:p>
     <w:tbl>
@@ -555,7 +555,7 @@
           </w:tcPr>
           <w:p>
             <w:r>
-              <w:t>Candidate</w:t>
+              <w:t>후보</w:t>
             </w:r>
           </w:p>
         </w:tc>
@@ -565,7 +565,7 @@
           </w:tcPr>
           <w:p>
             <w:r>
-              <w:t>Direct fit</w:t>
+              <w:t>직접 적합도</w:t>
             </w:r>
           </w:p>
         </w:tc>
@@ -575,7 +575,7 @@
           </w:tcPr>
           <w:p>
             <w:r>
-              <w:t>Key evidence</w:t>
+              <w:t>핵심 근거</w:t>
             </w:r>
           </w:p>
         </w:tc>
@@ -585,7 +585,7 @@
           </w:tcPr>
           <w:p>
             <w:r>
-              <w:t>Current view</w:t>
+              <w:t>현재 판단</w:t>
             </w:r>
           </w:p>
         </w:tc>
@@ -607,7 +607,7 @@
           </w:tcPr>
           <w:p>
             <w:r>
-              <w:t>High</w:t>
+              <w:t>높음</w:t>
             </w:r>
           </w:p>
         </w:tc>
@@ -617,7 +617,7 @@
           </w:tcPr>
           <w:p>
             <w:r>
-              <w:t>PP&amp;E additions; &gt;100k GB300 deployment</w:t>
+              <w:t>유형자산 증설, GB300 &gt;10만 개 배치</w:t>
             </w:r>
           </w:p>
         </w:tc>
@@ -627,7 +627,7 @@
           </w:tcPr>
           <w:p>
             <w:r>
-              <w:t>Best fit D1, ~45%</w:t>
+              <w:t>D1 최적, ~45%</w:t>
             </w:r>
           </w:p>
         </w:tc>
@@ -649,7 +649,7 @@
           </w:tcPr>
           <w:p>
             <w:r>
-              <w:t>High</w:t>
+              <w:t>높음</w:t>
             </w:r>
           </w:p>
         </w:tc>
@@ -659,7 +659,7 @@
           </w:tcPr>
           <w:p>
             <w:r>
-              <w:t>Massive AWS infra spend; &gt;1M+ NVIDIA GPU plan</w:t>
+              <w:t>AWS 인프라 지출 막대, NVIDIA GPU &gt;100만 개 계획</w:t>
             </w:r>
           </w:p>
         </w:tc>
@@ -669,7 +669,7 @@
           </w:tcPr>
           <w:p>
             <w:r>
-              <w:t>Best fit D3, ~50%</w:t>
+              <w:t>D3 최적, ~50%</w:t>
             </w:r>
           </w:p>
         </w:tc>
@@ -691,7 +691,7 @@
           </w:tcPr>
           <w:p>
             <w:r>
-              <w:t>Medium</w:t>
+              <w:t>중간</w:t>
             </w:r>
           </w:p>
         </w:tc>
@@ -701,7 +701,7 @@
           </w:tcPr>
           <w:p>
             <w:r>
-              <w:t>Huge capex; millions of NVIDIA GPUs; route fragmented</w:t>
+              <w:t>설비투자 막대, NVIDIA GPU 수백만 개, 다만 경로 분산</w:t>
             </w:r>
           </w:p>
         </w:tc>
@@ -711,7 +711,7 @@
           </w:tcPr>
           <w:p>
             <w:r>
-              <w:t>Plausible D2</w:t>
+              <w:t>D2 유력</w:t>
             </w:r>
           </w:p>
         </w:tc>
@@ -733,7 +733,7 @@
           </w:tcPr>
           <w:p>
             <w:r>
-              <w:t>Medium</w:t>
+              <w:t>중간</w:t>
             </w:r>
           </w:p>
         </w:tc>
@@ -743,7 +743,7 @@
           </w:tcPr>
           <w:p>
             <w:r>
-              <w:t>Huge capex but TPU-heavy</w:t>
+              <w:t>설비투자 크지만 TPU 비중 높음</w:t>
             </w:r>
           </w:p>
         </w:tc>
@@ -753,7 +753,7 @@
           </w:tcPr>
           <w:p>
             <w:r>
-              <w:t>Lower probability</w:t>
+              <w:t>확률 낮음</w:t>
             </w:r>
           </w:p>
         </w:tc>
@@ -775,7 +775,7 @@
           </w:tcPr>
           <w:p>
             <w:r>
-              <w:t>Low-Med</w:t>
+              <w:t>중하</w:t>
             </w:r>
           </w:p>
         </w:tc>
@@ -785,7 +785,7 @@
           </w:tcPr>
           <w:p>
             <w:r>
-              <w:t>AI commitments but customer-supplied/prepaid GPUs</w:t>
+              <w:t>AI 약정 있으나 고객 공급/선지급 GPU</w:t>
             </w:r>
           </w:p>
         </w:tc>
@@ -795,7 +795,7 @@
           </w:tcPr>
           <w:p>
             <w:r>
-              <w:t>Weak direct mapping</w:t>
+              <w:t>직접 대응 약함</w:t>
             </w:r>
           </w:p>
         </w:tc>
@@ -817,7 +817,7 @@
           </w:tcPr>
           <w:p>
             <w:r>
-              <w:t>Lower scale</w:t>
+              <w:t>규모 작음</w:t>
             </w:r>
           </w:p>
         </w:tc>
@@ -827,7 +827,7 @@
           </w:tcPr>
           <w:p>
             <w:r>
-              <w:t>100% NVIDIA GPU fleet</w:t>
+              <w:t>GPU 전량 NVIDIA</w:t>
             </w:r>
           </w:p>
         </w:tc>
@@ -837,7 +837,7 @@
           </w:tcPr>
           <w:p>
             <w:r>
-              <w:t>Unlikely top direct</w:t>
+              <w:t>최상위 직접고객 가능성 낮음</w:t>
             </w:r>
           </w:p>
         </w:tc>
@@ -848,7 +848,7 @@
         <w:pStyle w:val="Heading1"/>
       </w:pPr>
       <w:r>
-        <w:t>11. What is not proven</w:t>
+        <w:t>11. 입증되지 않은 것</w:t>
       </w:r>
     </w:p>
     <w:p>
@@ -856,7 +856,7 @@
         <w:pStyle w:val="ListBullet"/>
       </w:pPr>
       <w:r>
-        <w:t>Customer A/B/C persistent identity mappings.</w:t>
+        <w:t>Customer A/B/C를 기간을 넘는 고정 정체로 대응시키는 것.</w:t>
       </w:r>
     </w:p>
     <w:p>
@@ -864,7 +864,7 @@
         <w:pStyle w:val="ListBullet"/>
       </w:pPr>
       <w:r>
-        <w:t>D3 = AWS or D1 = Microsoft as confirmed fact.</w:t>
+        <w:t>D3 = AWS 또는 D1 = Microsoft를 확인된 사실로 두는 것.</w:t>
       </w:r>
     </w:p>
     <w:p>
@@ -872,7 +872,7 @@
         <w:pStyle w:val="ListBullet"/>
       </w:pPr>
       <w:r>
-        <w:t>OpenAI as NVIDIA's named anonymous Q2 AI research/deployment customer.</w:t>
+        <w:t>OpenAI를 NVIDIA가 지목한 익명 2분기 AI 연구/배치 고객으로 두는 것.</w:t>
       </w:r>
     </w:p>
     <w:p>
@@ -880,7 +880,7 @@
         <w:pStyle w:val="ListBullet"/>
       </w:pPr>
       <w:r>
-        <w:t>Taiwan revenue as a direct proxy for Foxconn/Quanta demand.</w:t>
+        <w:t>대만 매출을 Foxconn/Quanta 수요의 직접 대리지표로 쓰는 것.</w:t>
       </w:r>
     </w:p>
     <w:p>
@@ -888,7 +888,7 @@
         <w:pStyle w:val="ListBullet"/>
       </w:pPr>
       <w:r>
-        <w:t>Meta's total AI capex flowing directly to NVIDIA.</w:t>
+        <w:t>Meta의 AI 설비투자 전액이 NVIDIA로 흘러간다고 보는 것.</w:t>
       </w:r>
     </w:p>
     <w:p>
@@ -896,17 +896,17 @@
         <w:pStyle w:val="Heading1"/>
       </w:pPr>
       <w:r>
-        <w:t>12. Source links</w:t>
+        <w:t>12. 출처 링크</w:t>
       </w:r>
     </w:p>
     <w:p>
       <w:r>
-        <w:t>NVIDIA FY27 Q2 10-Q: https://www.sec.gov/Archives/edgar/data/1045810/000104581026000075/nvda-20260726.htm</w:t>
+        <w:t>NVIDIA FY27 2분기 10-Q: https://www.sec.gov/Archives/edgar/data/1045810/000104581026000075/nvda-20260726.htm</w:t>
       </w:r>
     </w:p>
     <w:p>
       <w:r>
-        <w:t>NVIDIA FY27 Q1 10-Q: https://www.sec.gov/Archives/edgar/data/1045810/000104581026000052/nvda-20260426.htm</w:t>
+        <w:t>NVIDIA FY27 1분기 10-Q: https://www.sec.gov/Archives/edgar/data/1045810/000104581026000052/nvda-20260426.htm</w:t>
       </w:r>
     </w:p>
     <w:p>
@@ -916,32 +916,32 @@
     </w:p>
     <w:p>
       <w:r>
-        <w:t>Microsoft Mar-26 10-Q: https://www.sec.gov/Archives/edgar/data/789019/000119312526191507/msft-20260331.htm</w:t>
+        <w:t>Microsoft 2026년 3월 10-Q: https://www.sec.gov/Archives/edgar/data/789019/000119312526191507/msft-20260331.htm</w:t>
       </w:r>
     </w:p>
     <w:p>
       <w:r>
-        <w:t>Microsoft Jun-26 filing: https://www.sec.gov/Archives/edgar/data/789019/000119312526323660/msft-20260630.htm</w:t>
+        <w:t>Microsoft 2026년 6월 서류: https://www.sec.gov/Archives/edgar/data/789019/000119312526323660/msft-20260630.htm</w:t>
       </w:r>
     </w:p>
     <w:p>
       <w:r>
-        <w:t>Amazon Q1 2026: https://www.sec.gov/Archives/edgar/data/1018724/000101872426000014/amzn-20260331.htm</w:t>
+        <w:t>Amazon 2026년 1분기: https://www.sec.gov/Archives/edgar/data/1018724/000101872426000014/amzn-20260331.htm</w:t>
       </w:r>
     </w:p>
     <w:p>
       <w:r>
-        <w:t>Amazon Q2 2026: https://www.sec.gov/Archives/edgar/data/1018724/000101872426000026/amzn-20260630.htm</w:t>
+        <w:t>Amazon 2026년 2분기: https://www.sec.gov/Archives/edgar/data/1018724/000101872426000026/amzn-20260630.htm</w:t>
       </w:r>
     </w:p>
     <w:p>
       <w:r>
-        <w:t>Meta Q1 2026: https://www.sec.gov/Archives/edgar/data/1326801/000162828026028526/meta-20260331.htm</w:t>
+        <w:t>Meta 2026년 1분기: https://www.sec.gov/Archives/edgar/data/1326801/000162828026028526/meta-20260331.htm</w:t>
       </w:r>
     </w:p>
     <w:p>
       <w:r>
-        <w:t>Meta Q2 2026: https://www.sec.gov/Archives/edgar/data/1326801/000162828026050705/meta-20260630.htm</w:t>
+        <w:t>Meta 2026년 2분기: https://www.sec.gov/Archives/edgar/data/1326801/000162828026050705/meta-20260630.htm</w:t>
       </w:r>
     </w:p>
     <w:sectPr>

</xml_diff>